<commit_message>
migracion de pruebas a vitest y correccion al editar productos
</commit_message>
<xml_diff>
--- a/documentos/ERS AWSDCraft v2.docx
+++ b/documentos/ERS AWSDCraft v2.docx
@@ -410,7 +410,7 @@
           <w:sz w:val="22"/>
           <w:szCs w:val="22"/>
         </w:rPr>
-        <w:t xml:space="preserve">Documentación oficial de React, React Router, Bootstrap, Jasmine y Karma.</w:t>
+        <w:t xml:space="preserve">Documentación oficial de React, React Router, Bootstrap, Vitest y Testing Library.</w:t>
       </w:r>
     </w:p>
     <w:p>
@@ -1101,7 +1101,7 @@
           <w:sz w:val="22"/>
           <w:szCs w:val="22"/>
         </w:rPr>
-        <w:t xml:space="preserve">Las pruebas unitarias deben desarrollarse con Jasmine y ejecutarse con Karma.</w:t>
+        <w:t xml:space="preserve">Las pruebas unitarias deben desarrollarse y ejecutarse con Vitest.</w:t>
       </w:r>
     </w:p>
     <w:p>
@@ -5675,7 +5675,7 @@
                 <w:sz w:val="20"/>
                 <w:szCs w:val="20"/>
               </w:rPr>
-              <w:t xml:space="preserve">Jasmine</w:t>
+              <w:t xml:space="preserve">Vitest</w:t>
             </w:r>
           </w:p>
         </w:tc>
@@ -5700,7 +5700,7 @@
                 <w:sz w:val="20"/>
                 <w:szCs w:val="20"/>
               </w:rPr>
-              <w:t xml:space="preserve">Framework para la escritura de las pruebas unitarias.</w:t>
+              <w:t xml:space="preserve">Framework de pruebas unitarias integrado con Vite, utilizado para escribir y ejecutar las pruebas.</w:t>
             </w:r>
           </w:p>
         </w:tc>
@@ -5727,7 +5727,7 @@
                 <w:sz w:val="20"/>
                 <w:szCs w:val="20"/>
               </w:rPr>
-              <w:t xml:space="preserve">Karma</w:t>
+              <w:t xml:space="preserve">Testing Library</w:t>
             </w:r>
           </w:p>
         </w:tc>
@@ -5752,7 +5752,7 @@
                 <w:sz w:val="20"/>
                 <w:szCs w:val="20"/>
               </w:rPr>
-              <w:t xml:space="preserve">Ejecutor de las pruebas sobre un navegador real en modo headless.</w:t>
+              <w:t xml:space="preserve">Utilidades para renderizar componentes y consultarlos como lo haría un usuario.</w:t>
             </w:r>
           </w:p>
         </w:tc>
@@ -5779,7 +5779,7 @@
                 <w:sz w:val="20"/>
                 <w:szCs w:val="20"/>
               </w:rPr>
-              <w:t xml:space="preserve">Istanbul</w:t>
+              <w:t xml:space="preserve">jsdom</w:t>
             </w:r>
           </w:p>
         </w:tc>
@@ -5804,7 +5804,59 @@
                 <w:sz w:val="20"/>
                 <w:szCs w:val="20"/>
               </w:rPr>
-              <w:t xml:space="preserve">Instrumentación del código para el cálculo de la cobertura.</w:t>
+              <w:t xml:space="preserve">Entorno que simula el navegador durante la ejecución de las pruebas.</w:t>
+            </w:r>
+          </w:p>
+        </w:tc>
+      </w:tr>
+      <w:tr>
+        <w:tc>
+          <w:tcPr>
+            <w:tcW w:type="dxa" w:w="2600"/>
+            <w:tcMar>
+              <w:top w:type="dxa" w:w="60"/>
+              <w:left w:type="dxa" w:w="100"/>
+              <w:bottom w:type="dxa" w:w="60"/>
+              <w:right w:type="dxa" w:w="100"/>
+            </w:tcMar>
+          </w:tcPr>
+          <w:p>
+            <w:pPr>
+              <w:spacing w:after="0"/>
+            </w:pPr>
+            <w:r>
+              <w:rPr>
+                <w:b w:val="false"/>
+                <w:bCs w:val="false"/>
+                <w:sz w:val="20"/>
+                <w:szCs w:val="20"/>
+              </w:rPr>
+              <w:t xml:space="preserve">Cobertura V8</w:t>
+            </w:r>
+          </w:p>
+        </w:tc>
+        <w:tc>
+          <w:tcPr>
+            <w:tcW w:type="dxa" w:w="6760"/>
+            <w:tcMar>
+              <w:top w:type="dxa" w:w="60"/>
+              <w:left w:type="dxa" w:w="100"/>
+              <w:bottom w:type="dxa" w:w="60"/>
+              <w:right w:type="dxa" w:w="100"/>
+            </w:tcMar>
+          </w:tcPr>
+          <w:p>
+            <w:pPr>
+              <w:spacing w:after="0"/>
+            </w:pPr>
+            <w:r>
+              <w:rPr>
+                <w:b w:val="false"/>
+                <w:bCs w:val="false"/>
+                <w:sz w:val="20"/>
+                <w:szCs w:val="20"/>
+              </w:rPr>
+              <w:t xml:space="preserve">Proveedor de cobertura de código integrado en Vitest.</w:t>
             </w:r>
           </w:p>
         </w:tc>
@@ -6367,7 +6419,7 @@
                 <w:sz w:val="20"/>
                 <w:szCs w:val="20"/>
               </w:rPr>
-              <w:t xml:space="preserve">Especificaciones de Jasmine.</w:t>
+              <w:t xml:space="preserve">Especificaciones de Vitest y su archivo de configuración.</w:t>
             </w:r>
           </w:p>
         </w:tc>

</xml_diff>